<commit_message>
v2.0.0 — รวม plugin สาขาเข้า software-company · A-Team มีหัวหน้าทีม · log · inbox · CONTEXT.md
- รวม plugin software-company-* ทุกสาขาเข้า software-company (38 agents · 101 skills · 28 commands)
- agent-team: หัวหน้าทีมหนึ่งตัวคุมลูกทีม · โมเดล 3 ระดับ ใหญ่/กลาง/เล็ก สลับกลางทางได้
- ไม่หยุดถามระหว่างงาน: งานย้อนไม่ได้เข้าคิว "รออนุมัติ" · ค้นเองต้องมี 3 แหล่งยืนยัน
- principle ใหม่ 5 ตัว + skill blast-radius · รับแนวคิดจาก pstack (how/why/teach, hillclimb, คัดคอมเมนต์, ตัดกลิ่น AI)
- work-session-context: CONTEXT.md กลาง · .a-team/inbox คิวข้อความ · hook เขียน .a-team/log
- IMPROVEMENTS.md · ข้อเสนอปรับปรุงในรายงานตอนจบ
- แก้คำสั่งที่ขัดกันทั้งชุด · อัปเดตเอกสาร รูป และ dist/

Co-Authored-By: Claude Opus 5.5 <noreply@anthropic.com>
Claude-Session: https://claude.ai/code/session_01T7pjgEfEmYEe9F3X17B4V9
</commit_message>
<xml_diff>
--- a/dist/codex/.agents/skills/branded-document-design/examples/example_srs.docx
+++ b/dist/codex/.agents/skills/branded-document-design/examples/example_srs.docx
@@ -4,61 +4,292 @@
   <w:body>
     <w:p>
       <w:pPr>
-        <w:spacing w:after="3000"/>
-      </w:pPr>
-    </w:p>
-    <w:p>
-      <w:pPr>
-        <w:spacing w:after="80"/>
-        <w:jc w:val="center"/>
+        <w:spacing w:after="0" w:before="0" w:line="240" w:lineRule="auto"/>
       </w:pPr>
       <w:r>
         <w:rPr>
           <w:rFonts w:ascii="Tahoma" w:hAnsi="Tahoma" w:cs="Tahoma" w:eastAsia="Tahoma"/>
-          <w:b/>
-          <w:bCs/>
-          <w:color w:val="2A78D6"/>
-          <w:sz w:val="40"/>
-          <w:szCs w:val="40"/>
+          <w:sz w:val="20"/>
+          <w:szCs w:val="20"/>
         </w:rPr>
-        <w:t>เอกสารข้อกำหนดซอฟต์แวร์ (Software Specification)</w:t>
       </w:r>
     </w:p>
+    <w:tbl>
+      <w:tblPr>
+        <w:tblW w:type="auto" w:w="0"/>
+        <w:tblLook w:firstColumn="1" w:firstRow="1" w:lastColumn="0" w:lastRow="0" w:noHBand="0" w:noVBand="1" w:val="04A0"/>
+        <w:tblLayout w:type="fixed"/>
+        <w:tblW w:w="9360" w:type="dxa"/>
+        <w:tblBorders>
+          <w:top w:val="none" w:sz="0" w:space="0" w:color="auto"/>
+          <w:left w:val="none" w:sz="0" w:space="0" w:color="auto"/>
+          <w:bottom w:val="none" w:sz="0" w:space="0" w:color="auto"/>
+          <w:right w:val="none" w:sz="0" w:space="0" w:color="auto"/>
+          <w:insideH w:val="none" w:sz="0" w:space="0" w:color="auto"/>
+          <w:insideV w:val="none" w:sz="0" w:space="0" w:color="auto"/>
+        </w:tblBorders>
+        <w:tblCellMar>
+          <w:top w:w="260" w:type="dxa"/>
+          <w:left w:w="340" w:type="dxa"/>
+          <w:bottom w:w="300" w:type="dxa"/>
+          <w:right w:w="340" w:type="dxa"/>
+        </w:tblCellMar>
+      </w:tblPr>
+      <w:tblGrid>
+        <w:gridCol w:w="9360"/>
+      </w:tblGrid>
+      <w:tr>
+        <w:tc>
+          <w:tcPr>
+            <w:tcW w:type="dxa" w:w="9360"/>
+            <w:shd w:val="clear" w:color="auto" w:fill="2A78D6"/>
+          </w:tcPr>
+          <w:p>
+            <w:pPr>
+              <w:spacing w:after="120"/>
+            </w:pPr>
+            <w:r/>
+            <w:r>
+              <w:rPr>
+                <w:rFonts w:ascii="Tahoma" w:hAnsi="Tahoma" w:cs="Tahoma" w:eastAsia="Tahoma"/>
+                <w:b/>
+                <w:bCs/>
+                <w:color w:val="FFFFFF"/>
+                <w:sz w:val="18"/>
+                <w:szCs w:val="18"/>
+              </w:rPr>
+              <w:t>SQUARE TECH SOLUTIONS</w:t>
+            </w:r>
+          </w:p>
+          <w:p>
+            <w:pPr>
+              <w:spacing w:after="80"/>
+            </w:pPr>
+            <w:r>
+              <w:rPr>
+                <w:rFonts w:ascii="Tahoma" w:hAnsi="Tahoma" w:cs="Tahoma" w:eastAsia="Tahoma"/>
+                <w:b/>
+                <w:bCs/>
+                <w:color w:val="FFFFFF"/>
+                <w:sz w:val="40"/>
+                <w:szCs w:val="40"/>
+              </w:rPr>
+              <w:t>เอกสารข้อกำหนดซอฟต์แวร์ (Software Specification)</w:t>
+            </w:r>
+          </w:p>
+          <w:p>
+            <w:r>
+              <w:rPr>
+                <w:rFonts w:ascii="Tahoma" w:hAnsi="Tahoma" w:cs="Tahoma" w:eastAsia="Tahoma"/>
+                <w:b/>
+                <w:bCs/>
+                <w:color w:val="D9E6F8"/>
+                <w:sz w:val="29"/>
+                <w:szCs w:val="29"/>
+              </w:rPr>
+              <w:t>ระบบ Apps Track — Project Control &amp; Monitor</w:t>
+            </w:r>
+          </w:p>
+        </w:tc>
+      </w:tr>
+    </w:tbl>
     <w:p>
       <w:pPr>
-        <w:spacing w:after="360"/>
-        <w:jc w:val="center"/>
+        <w:spacing w:after="0" w:before="0" w:line="240" w:lineRule="auto"/>
       </w:pPr>
       <w:r>
         <w:rPr>
           <w:rFonts w:ascii="Tahoma" w:hAnsi="Tahoma" w:cs="Tahoma" w:eastAsia="Tahoma"/>
-          <w:b/>
-          <w:bCs/>
-          <w:color w:val="333B4A"/>
-          <w:sz w:val="29"/>
-          <w:szCs w:val="29"/>
+          <w:sz w:val="48"/>
+          <w:szCs w:val="48"/>
         </w:rPr>
-        <w:t>ระบบ Apps Track — Project Control &amp; Monitor</w:t>
       </w:r>
     </w:p>
+    <w:tbl>
+      <w:tblPr>
+        <w:tblW w:type="auto" w:w="0"/>
+        <w:tblLook w:firstColumn="1" w:firstRow="1" w:lastColumn="0" w:lastRow="0" w:noHBand="0" w:noVBand="1" w:val="04A0"/>
+        <w:tblLayout w:type="fixed"/>
+        <w:tblW w:w="9360" w:type="dxa"/>
+        <w:tblBorders>
+          <w:top w:val="single" w:sz="4" w:space="0" w:color="E4E7EE"/>
+          <w:left w:val="single" w:sz="4" w:space="0" w:color="E4E7EE"/>
+          <w:bottom w:val="single" w:sz="4" w:space="0" w:color="E4E7EE"/>
+          <w:right w:val="single" w:sz="4" w:space="0" w:color="E4E7EE"/>
+          <w:insideH w:val="single" w:sz="4" w:space="0" w:color="E4E7EE"/>
+          <w:insideV w:val="single" w:sz="4" w:space="0" w:color="E4E7EE"/>
+        </w:tblBorders>
+        <w:tblCellMar>
+          <w:top w:w="70" w:type="dxa"/>
+          <w:left w:w="360" w:type="dxa"/>
+          <w:bottom w:w="70" w:type="dxa"/>
+          <w:right w:w="360" w:type="dxa"/>
+        </w:tblCellMar>
+      </w:tblPr>
+      <w:tblGrid>
+        <w:gridCol w:w="2400"/>
+        <w:gridCol w:w="6960"/>
+      </w:tblGrid>
+      <w:tr>
+        <w:tc>
+          <w:tcPr>
+            <w:tcW w:type="dxa" w:w="2400"/>
+            <w:shd w:val="clear" w:color="auto" w:fill="EDF1FB"/>
+            <w:vAlign w:val="center"/>
+          </w:tcPr>
+          <w:p>
+            <w:r>
+              <w:rPr>
+                <w:rFonts w:ascii="Tahoma" w:hAnsi="Tahoma" w:cs="Tahoma" w:eastAsia="Tahoma"/>
+                <w:b/>
+                <w:bCs/>
+                <w:color w:val="2A4C86"/>
+                <w:sz w:val="18"/>
+                <w:szCs w:val="18"/>
+              </w:rPr>
+              <w:t>เวอร์ชัน</w:t>
+            </w:r>
+          </w:p>
+        </w:tc>
+        <w:tc>
+          <w:tcPr>
+            <w:tcW w:type="dxa" w:w="6960"/>
+            <w:vAlign w:val="center"/>
+          </w:tcPr>
+          <w:p>
+            <w:r>
+              <w:rPr>
+                <w:rFonts w:ascii="Tahoma" w:hAnsi="Tahoma" w:cs="Tahoma" w:eastAsia="Tahoma"/>
+                <w:color w:val="414957"/>
+                <w:sz w:val="18"/>
+                <w:szCs w:val="18"/>
+              </w:rPr>
+              <w:t>3.5</w:t>
+            </w:r>
+          </w:p>
+        </w:tc>
+      </w:tr>
+      <w:tr>
+        <w:tc>
+          <w:tcPr>
+            <w:tcW w:type="dxa" w:w="2400"/>
+            <w:shd w:val="clear" w:color="auto" w:fill="EDF1FB"/>
+            <w:vAlign w:val="center"/>
+          </w:tcPr>
+          <w:p>
+            <w:r>
+              <w:rPr>
+                <w:rFonts w:ascii="Tahoma" w:hAnsi="Tahoma" w:cs="Tahoma" w:eastAsia="Tahoma"/>
+                <w:b/>
+                <w:bCs/>
+                <w:color w:val="2A4C86"/>
+                <w:sz w:val="18"/>
+                <w:szCs w:val="18"/>
+              </w:rPr>
+              <w:t>ปรับปรุง</w:t>
+            </w:r>
+          </w:p>
+        </w:tc>
+        <w:tc>
+          <w:tcPr>
+            <w:tcW w:type="dxa" w:w="6960"/>
+            <w:vAlign w:val="center"/>
+          </w:tcPr>
+          <w:p>
+            <w:r>
+              <w:rPr>
+                <w:rFonts w:ascii="Tahoma" w:hAnsi="Tahoma" w:cs="Tahoma" w:eastAsia="Tahoma"/>
+                <w:color w:val="414957"/>
+                <w:sz w:val="18"/>
+                <w:szCs w:val="18"/>
+              </w:rPr>
+              <w:t>19 กรกฎาคม 2026</w:t>
+            </w:r>
+          </w:p>
+        </w:tc>
+      </w:tr>
+      <w:tr>
+        <w:tc>
+          <w:tcPr>
+            <w:tcW w:type="dxa" w:w="2400"/>
+            <w:shd w:val="clear" w:color="auto" w:fill="EDF1FB"/>
+            <w:vAlign w:val="center"/>
+          </w:tcPr>
+          <w:p>
+            <w:r>
+              <w:rPr>
+                <w:rFonts w:ascii="Tahoma" w:hAnsi="Tahoma" w:cs="Tahoma" w:eastAsia="Tahoma"/>
+                <w:b/>
+                <w:bCs/>
+                <w:color w:val="2A4C86"/>
+                <w:sz w:val="18"/>
+                <w:szCs w:val="18"/>
+              </w:rPr>
+              <w:t>สถานะ</w:t>
+            </w:r>
+          </w:p>
+        </w:tc>
+        <w:tc>
+          <w:tcPr>
+            <w:tcW w:type="dxa" w:w="6960"/>
+            <w:vAlign w:val="center"/>
+          </w:tcPr>
+          <w:p>
+            <w:r>
+              <w:rPr>
+                <w:rFonts w:ascii="Tahoma" w:hAnsi="Tahoma" w:cs="Tahoma" w:eastAsia="Tahoma"/>
+                <w:color w:val="414957"/>
+                <w:sz w:val="18"/>
+                <w:szCs w:val="18"/>
+              </w:rPr>
+              <w:t>ฉบับร่างเพื่อทบทวน (Draft for review)</w:t>
+            </w:r>
+          </w:p>
+        </w:tc>
+      </w:tr>
+      <w:tr>
+        <w:tc>
+          <w:tcPr>
+            <w:tcW w:type="dxa" w:w="2400"/>
+            <w:shd w:val="clear" w:color="auto" w:fill="EDF1FB"/>
+            <w:vAlign w:val="center"/>
+          </w:tcPr>
+          <w:p>
+            <w:r>
+              <w:rPr>
+                <w:rFonts w:ascii="Tahoma" w:hAnsi="Tahoma" w:cs="Tahoma" w:eastAsia="Tahoma"/>
+                <w:b/>
+                <w:bCs/>
+                <w:color w:val="2A4C86"/>
+                <w:sz w:val="18"/>
+                <w:szCs w:val="18"/>
+              </w:rPr>
+              <w:t>ผู้จัดทำ</w:t>
+            </w:r>
+          </w:p>
+        </w:tc>
+        <w:tc>
+          <w:tcPr>
+            <w:tcW w:type="dxa" w:w="6960"/>
+            <w:vAlign w:val="center"/>
+          </w:tcPr>
+          <w:p>
+            <w:r>
+              <w:rPr>
+                <w:rFonts w:ascii="Tahoma" w:hAnsi="Tahoma" w:cs="Tahoma" w:eastAsia="Tahoma"/>
+                <w:color w:val="414957"/>
+                <w:sz w:val="18"/>
+                <w:szCs w:val="18"/>
+              </w:rPr>
+              <w:t>ทีมพัฒนา Square Tech Solutions</w:t>
+            </w:r>
+          </w:p>
+        </w:tc>
+      </w:tr>
+    </w:tbl>
     <w:p>
       <w:pPr>
-        <w:spacing w:after="40"/>
-        <w:jc w:val="center"/>
-      </w:pPr>
-      <w:r>
-        <w:rPr>
-          <w:rFonts w:ascii="Tahoma" w:hAnsi="Tahoma" w:cs="Tahoma" w:eastAsia="Tahoma"/>
-          <w:color w:val="414957"/>
-          <w:sz w:val="18"/>
-          <w:szCs w:val="18"/>
-        </w:rPr>
-        <w:t>เวอร์ชันเอกสาร 3.5  •  ปรับปรุง 19 กรกฎาคม 2026</w:t>
-      </w:r>
-    </w:p>
-    <w:p>
-      <w:pPr>
-        <w:jc w:val="center"/>
+        <w:spacing w:before="200"/>
       </w:pPr>
       <w:r>
         <w:rPr>
@@ -141,6 +372,7 @@
           <w:tcPr>
             <w:tcW w:type="dxa" w:w="2340"/>
             <w:shd w:val="clear" w:color="auto" w:fill="EDF1FB"/>
+            <w:vAlign w:val="center"/>
           </w:tcPr>
           <w:p>
             <w:pPr>
@@ -179,6 +411,7 @@
           <w:tcPr>
             <w:tcW w:type="dxa" w:w="2340"/>
             <w:shd w:val="clear" w:color="auto" w:fill="EDF1FB"/>
+            <w:vAlign w:val="center"/>
           </w:tcPr>
           <w:p>
             <w:pPr>
@@ -217,6 +450,7 @@
           <w:tcPr>
             <w:tcW w:type="dxa" w:w="2340"/>
             <w:shd w:val="clear" w:color="auto" w:fill="EDF1FB"/>
+            <w:vAlign w:val="center"/>
           </w:tcPr>
           <w:p>
             <w:pPr>
@@ -255,6 +489,7 @@
           <w:tcPr>
             <w:tcW w:type="dxa" w:w="2340"/>
             <w:shd w:val="clear" w:color="auto" w:fill="EDF1FB"/>
+            <w:vAlign w:val="center"/>
           </w:tcPr>
           <w:p>
             <w:pPr>
@@ -337,6 +572,7 @@
           <w:tcPr>
             <w:tcW w:type="dxa" w:w="2600"/>
             <w:shd w:val="clear" w:color="auto" w:fill="EDF1FB"/>
+            <w:vAlign w:val="center"/>
           </w:tcPr>
           <w:p>
             <w:pPr>
@@ -359,6 +595,7 @@
           <w:tcPr>
             <w:tcW w:type="dxa" w:w="6760"/>
             <w:shd w:val="clear" w:color="auto" w:fill="EDF1FB"/>
+            <w:vAlign w:val="center"/>
           </w:tcPr>
           <w:p>
             <w:pPr>
@@ -382,6 +619,7 @@
         <w:tc>
           <w:tcPr>
             <w:tcW w:type="dxa" w:w="2600"/>
+            <w:vAlign w:val="center"/>
           </w:tcPr>
           <w:p>
             <w:pPr>
@@ -401,6 +639,7 @@
         <w:tc>
           <w:tcPr>
             <w:tcW w:type="dxa" w:w="6760"/>
+            <w:vAlign w:val="center"/>
           </w:tcPr>
           <w:p>
             <w:pPr>
@@ -422,6 +661,7 @@
         <w:tc>
           <w:tcPr>
             <w:tcW w:type="dxa" w:w="2600"/>
+            <w:vAlign w:val="center"/>
           </w:tcPr>
           <w:p>
             <w:pPr>
@@ -441,6 +681,7 @@
         <w:tc>
           <w:tcPr>
             <w:tcW w:type="dxa" w:w="6760"/>
+            <w:vAlign w:val="center"/>
           </w:tcPr>
           <w:p>
             <w:pPr>
@@ -462,6 +703,7 @@
         <w:tc>
           <w:tcPr>
             <w:tcW w:type="dxa" w:w="2600"/>
+            <w:vAlign w:val="center"/>
           </w:tcPr>
           <w:p>
             <w:pPr>
@@ -481,6 +723,7 @@
         <w:tc>
           <w:tcPr>
             <w:tcW w:type="dxa" w:w="6760"/>
+            <w:vAlign w:val="center"/>
           </w:tcPr>
           <w:p>
             <w:pPr>
@@ -502,6 +745,7 @@
         <w:tc>
           <w:tcPr>
             <w:tcW w:type="dxa" w:w="2600"/>
+            <w:vAlign w:val="center"/>
           </w:tcPr>
           <w:p>
             <w:pPr>
@@ -521,6 +765,7 @@
         <w:tc>
           <w:tcPr>
             <w:tcW w:type="dxa" w:w="6760"/>
+            <w:vAlign w:val="center"/>
           </w:tcPr>
           <w:p>
             <w:pPr>
@@ -814,6 +1059,7 @@
           <w:tcPr>
             <w:tcW w:type="dxa" w:w="1100"/>
             <w:shd w:val="clear" w:color="auto" w:fill="EDF1FB"/>
+            <w:vAlign w:val="center"/>
           </w:tcPr>
           <w:p>
             <w:pPr>
@@ -836,6 +1082,7 @@
           <w:tcPr>
             <w:tcW w:type="dxa" w:w="4200"/>
             <w:shd w:val="clear" w:color="auto" w:fill="EDF1FB"/>
+            <w:vAlign w:val="center"/>
           </w:tcPr>
           <w:p>
             <w:pPr>
@@ -858,6 +1105,7 @@
           <w:tcPr>
             <w:tcW w:type="dxa" w:w="1900"/>
             <w:shd w:val="clear" w:color="auto" w:fill="EDF1FB"/>
+            <w:vAlign w:val="center"/>
           </w:tcPr>
           <w:p>
             <w:pPr>
@@ -880,6 +1128,7 @@
           <w:tcPr>
             <w:tcW w:type="dxa" w:w="2160"/>
             <w:shd w:val="clear" w:color="auto" w:fill="EDF1FB"/>
+            <w:vAlign w:val="center"/>
           </w:tcPr>
           <w:p>
             <w:pPr>
@@ -903,6 +1152,7 @@
         <w:tc>
           <w:tcPr>
             <w:tcW w:type="dxa" w:w="1100"/>
+            <w:vAlign w:val="center"/>
           </w:tcPr>
           <w:p>
             <w:pPr>
@@ -922,6 +1172,7 @@
         <w:tc>
           <w:tcPr>
             <w:tcW w:type="dxa" w:w="4200"/>
+            <w:vAlign w:val="center"/>
           </w:tcPr>
           <w:p>
             <w:pPr>
@@ -941,6 +1192,7 @@
         <w:tc>
           <w:tcPr>
             <w:tcW w:type="dxa" w:w="1900"/>
+            <w:vAlign w:val="center"/>
           </w:tcPr>
           <w:p>
             <w:pPr>
@@ -960,6 +1212,7 @@
         <w:tc>
           <w:tcPr>
             <w:tcW w:type="dxa" w:w="2160"/>
+            <w:vAlign w:val="center"/>
             <w:shd w:val="clear" w:color="auto" w:fill="E9F7EF"/>
           </w:tcPr>
           <w:p>
@@ -987,6 +1240,7 @@
         <w:tc>
           <w:tcPr>
             <w:tcW w:type="dxa" w:w="1100"/>
+            <w:vAlign w:val="center"/>
           </w:tcPr>
           <w:p>
             <w:pPr>
@@ -1006,6 +1260,7 @@
         <w:tc>
           <w:tcPr>
             <w:tcW w:type="dxa" w:w="4200"/>
+            <w:vAlign w:val="center"/>
           </w:tcPr>
           <w:p>
             <w:pPr>
@@ -1025,6 +1280,7 @@
         <w:tc>
           <w:tcPr>
             <w:tcW w:type="dxa" w:w="1900"/>
+            <w:vAlign w:val="center"/>
           </w:tcPr>
           <w:p>
             <w:pPr>
@@ -1044,6 +1300,7 @@
         <w:tc>
           <w:tcPr>
             <w:tcW w:type="dxa" w:w="2160"/>
+            <w:vAlign w:val="center"/>
             <w:shd w:val="clear" w:color="auto" w:fill="FDF5E4"/>
           </w:tcPr>
           <w:p>
@@ -1071,6 +1328,7 @@
         <w:tc>
           <w:tcPr>
             <w:tcW w:type="dxa" w:w="1100"/>
+            <w:vAlign w:val="center"/>
           </w:tcPr>
           <w:p>
             <w:pPr>
@@ -1090,6 +1348,7 @@
         <w:tc>
           <w:tcPr>
             <w:tcW w:type="dxa" w:w="4200"/>
+            <w:vAlign w:val="center"/>
           </w:tcPr>
           <w:p>
             <w:pPr>
@@ -1109,6 +1368,7 @@
         <w:tc>
           <w:tcPr>
             <w:tcW w:type="dxa" w:w="1900"/>
+            <w:vAlign w:val="center"/>
           </w:tcPr>
           <w:p>
             <w:pPr>
@@ -1128,6 +1388,7 @@
         <w:tc>
           <w:tcPr>
             <w:tcW w:type="dxa" w:w="2160"/>
+            <w:vAlign w:val="center"/>
             <w:shd w:val="clear" w:color="auto" w:fill="FDF5E4"/>
           </w:tcPr>
           <w:p>
@@ -1155,6 +1416,7 @@
         <w:tc>
           <w:tcPr>
             <w:tcW w:type="dxa" w:w="1100"/>
+            <w:vAlign w:val="center"/>
           </w:tcPr>
           <w:p>
             <w:pPr>
@@ -1174,6 +1436,7 @@
         <w:tc>
           <w:tcPr>
             <w:tcW w:type="dxa" w:w="4200"/>
+            <w:vAlign w:val="center"/>
           </w:tcPr>
           <w:p>
             <w:pPr>
@@ -1193,6 +1456,7 @@
         <w:tc>
           <w:tcPr>
             <w:tcW w:type="dxa" w:w="1900"/>
+            <w:vAlign w:val="center"/>
           </w:tcPr>
           <w:p>
             <w:pPr>
@@ -1212,6 +1476,7 @@
         <w:tc>
           <w:tcPr>
             <w:tcW w:type="dxa" w:w="2160"/>
+            <w:vAlign w:val="center"/>
             <w:shd w:val="clear" w:color="auto" w:fill="F2F4F8"/>
           </w:tcPr>
           <w:p>
@@ -1239,6 +1504,7 @@
         <w:tc>
           <w:tcPr>
             <w:tcW w:type="dxa" w:w="1100"/>
+            <w:vAlign w:val="center"/>
           </w:tcPr>
           <w:p>
             <w:pPr>
@@ -1258,6 +1524,7 @@
         <w:tc>
           <w:tcPr>
             <w:tcW w:type="dxa" w:w="4200"/>
+            <w:vAlign w:val="center"/>
           </w:tcPr>
           <w:p>
             <w:pPr>
@@ -1277,6 +1544,7 @@
         <w:tc>
           <w:tcPr>
             <w:tcW w:type="dxa" w:w="1900"/>
+            <w:vAlign w:val="center"/>
           </w:tcPr>
           <w:p>
             <w:pPr>
@@ -1296,6 +1564,7 @@
         <w:tc>
           <w:tcPr>
             <w:tcW w:type="dxa" w:w="2160"/>
+            <w:vAlign w:val="center"/>
             <w:shd w:val="clear" w:color="auto" w:fill="FDEDEC"/>
           </w:tcPr>
           <w:p>
@@ -1521,6 +1790,7 @@
           <w:tcPr>
             <w:tcW w:type="dxa" w:w="2400"/>
             <w:shd w:val="clear" w:color="auto" w:fill="EDF1FB"/>
+            <w:vAlign w:val="center"/>
           </w:tcPr>
           <w:p>
             <w:pPr>
@@ -1543,6 +1813,7 @@
           <w:tcPr>
             <w:tcW w:type="dxa" w:w="2900"/>
             <w:shd w:val="clear" w:color="auto" w:fill="EDF1FB"/>
+            <w:vAlign w:val="center"/>
           </w:tcPr>
           <w:p>
             <w:pPr>
@@ -1565,6 +1836,7 @@
           <w:tcPr>
             <w:tcW w:type="dxa" w:w="2400"/>
             <w:shd w:val="clear" w:color="auto" w:fill="EDF1FB"/>
+            <w:vAlign w:val="center"/>
           </w:tcPr>
           <w:p>
             <w:pPr>
@@ -1587,6 +1859,7 @@
           <w:tcPr>
             <w:tcW w:type="dxa" w:w="1660"/>
             <w:shd w:val="clear" w:color="auto" w:fill="EDF1FB"/>
+            <w:vAlign w:val="center"/>
           </w:tcPr>
           <w:p>
             <w:pPr>
@@ -1610,6 +1883,7 @@
         <w:tc>
           <w:tcPr>
             <w:tcW w:type="dxa" w:w="2400"/>
+            <w:vAlign w:val="center"/>
           </w:tcPr>
           <w:p>
             <w:pPr>
@@ -1629,6 +1903,7 @@
         <w:tc>
           <w:tcPr>
             <w:tcW w:type="dxa" w:w="2900"/>
+            <w:vAlign w:val="center"/>
           </w:tcPr>
           <w:p>
             <w:pPr>
@@ -1648,6 +1923,7 @@
         <w:tc>
           <w:tcPr>
             <w:tcW w:type="dxa" w:w="2400"/>
+            <w:vAlign w:val="center"/>
           </w:tcPr>
           <w:p>
             <w:pPr>
@@ -1666,6 +1942,7 @@
         <w:tc>
           <w:tcPr>
             <w:tcW w:type="dxa" w:w="1660"/>
+            <w:vAlign w:val="center"/>
           </w:tcPr>
           <w:p>
             <w:pPr>
@@ -1686,6 +1963,7 @@
         <w:tc>
           <w:tcPr>
             <w:tcW w:type="dxa" w:w="2400"/>
+            <w:vAlign w:val="center"/>
           </w:tcPr>
           <w:p>
             <w:pPr>
@@ -1705,6 +1983,7 @@
         <w:tc>
           <w:tcPr>
             <w:tcW w:type="dxa" w:w="2900"/>
+            <w:vAlign w:val="center"/>
           </w:tcPr>
           <w:p>
             <w:pPr>
@@ -1724,6 +2003,7 @@
         <w:tc>
           <w:tcPr>
             <w:tcW w:type="dxa" w:w="2400"/>
+            <w:vAlign w:val="center"/>
           </w:tcPr>
           <w:p>
             <w:pPr>
@@ -1742,6 +2022,7 @@
         <w:tc>
           <w:tcPr>
             <w:tcW w:type="dxa" w:w="1660"/>
+            <w:vAlign w:val="center"/>
           </w:tcPr>
           <w:p>
             <w:pPr>
@@ -1762,6 +2043,7 @@
         <w:tc>
           <w:tcPr>
             <w:tcW w:type="dxa" w:w="2400"/>
+            <w:vAlign w:val="center"/>
           </w:tcPr>
           <w:p>
             <w:pPr>
@@ -1781,6 +2063,7 @@
         <w:tc>
           <w:tcPr>
             <w:tcW w:type="dxa" w:w="2900"/>
+            <w:vAlign w:val="center"/>
           </w:tcPr>
           <w:p>
             <w:pPr>
@@ -1800,6 +2083,7 @@
         <w:tc>
           <w:tcPr>
             <w:tcW w:type="dxa" w:w="2400"/>
+            <w:vAlign w:val="center"/>
           </w:tcPr>
           <w:p>
             <w:pPr>
@@ -1818,6 +2102,7 @@
         <w:tc>
           <w:tcPr>
             <w:tcW w:type="dxa" w:w="1660"/>
+            <w:vAlign w:val="center"/>
           </w:tcPr>
           <w:p>
             <w:pPr>

</xml_diff>